<commit_message>
Projeto e Documentação feitos
</commit_message>
<xml_diff>
--- a/Manual_Sistema_Gestao_Escolar.docx
+++ b/Manual_Sistema_Gestao_Escolar.docx
@@ -64,6 +64,14 @@
           <w:szCs w:val="22"/>
         </w:rPr>
         <w:t xml:space="preserve">Vinicius </w:t>
+      </w:r>
+      <w:r>
+        <w:rPr>
+          <w:rFonts w:ascii="Calibri" w:eastAsia="Calibri" w:hAnsi="Calibri" w:cs="Calibri"/>
+          <w:sz w:val="22"/>
+          <w:szCs w:val="22"/>
+        </w:rPr>
+        <w:t xml:space="preserve">da Silva </w:t>
       </w:r>
       <w:proofErr w:type="spellStart"/>
       <w:r>
@@ -144,12 +152,6 @@
         <w:gridCol w:w="3006"/>
       </w:tblGrid>
       <w:tr>
-        <w:tblPrEx>
-          <w:tblCellMar>
-            <w:top w:w="0" w:type="dxa"/>
-            <w:bottom w:w="0" w:type="dxa"/>
-          </w:tblCellMar>
-        </w:tblPrEx>
         <w:tc>
           <w:tcPr>
             <w:tcW w:w="1650" w:type="pct"/>
@@ -212,12 +214,6 @@
         </w:tc>
       </w:tr>
       <w:tr>
-        <w:tblPrEx>
-          <w:tblCellMar>
-            <w:top w:w="0" w:type="dxa"/>
-            <w:bottom w:w="0" w:type="dxa"/>
-          </w:tblCellMar>
-        </w:tblPrEx>
         <w:tc>
           <w:tcPr>
             <w:tcW w:w="1650" w:type="pct"/>
@@ -248,7 +244,14 @@
                 <w:rFonts w:ascii="Calibri" w:eastAsia="Calibri" w:hAnsi="Calibri" w:cs="Calibri"/>
                 <w:color w:val="000000"/>
               </w:rPr>
-              <w:t>09/07/2026</w:t>
+              <w:t>14</w:t>
+            </w:r>
+            <w:r>
+              <w:rPr>
+                <w:rFonts w:ascii="Calibri" w:eastAsia="Calibri" w:hAnsi="Calibri" w:cs="Calibri"/>
+                <w:color w:val="000000"/>
+              </w:rPr>
+              <w:t>/07/2026</w:t>
             </w:r>
           </w:p>
         </w:tc>
@@ -607,32 +610,23 @@
           <w:sz w:val="22"/>
           <w:szCs w:val="22"/>
         </w:rPr>
-        <w:t>13. Estrutura do Banco de Dados</w:t>
-      </w:r>
-      <w:r>
-        <w:rPr>
-          <w:rFonts w:ascii="Calibri" w:eastAsia="Calibri" w:hAnsi="Calibri" w:cs="Calibri"/>
-          <w:sz w:val="22"/>
-          <w:szCs w:val="22"/>
-        </w:rPr>
-        <w:tab/>
-        <w:t>9</w:t>
-      </w:r>
-    </w:p>
-    <w:p>
-      <w:pPr>
-        <w:tabs>
-          <w:tab w:val="right" w:leader="dot" w:pos="9026"/>
-        </w:tabs>
-        <w:spacing w:after="120"/>
-      </w:pPr>
-      <w:r>
-        <w:rPr>
-          <w:rFonts w:ascii="Calibri" w:eastAsia="Calibri" w:hAnsi="Calibri" w:cs="Calibri"/>
-          <w:sz w:val="22"/>
-          <w:szCs w:val="22"/>
-        </w:rPr>
-        <w:t>14. Considerações Finais</w:t>
+        <w:t>1</w:t>
+      </w:r>
+      <w:r>
+        <w:rPr>
+          <w:rFonts w:ascii="Calibri" w:eastAsia="Calibri" w:hAnsi="Calibri" w:cs="Calibri"/>
+          <w:sz w:val="22"/>
+          <w:szCs w:val="22"/>
+        </w:rPr>
+        <w:t>3</w:t>
+      </w:r>
+      <w:r>
+        <w:rPr>
+          <w:rFonts w:ascii="Calibri" w:eastAsia="Calibri" w:hAnsi="Calibri" w:cs="Calibri"/>
+          <w:sz w:val="22"/>
+          <w:szCs w:val="22"/>
+        </w:rPr>
+        <w:t>. Considerações Finais</w:t>
       </w:r>
       <w:r>
         <w:rPr>
@@ -1250,7 +1244,7 @@
           <w:sz w:val="22"/>
           <w:szCs w:val="22"/>
         </w:rPr>
-        <w:t xml:space="preserve"> — configurações do sistema (tema claro/escuro)</w:t>
+        <w:t xml:space="preserve"> — configurações do sistema</w:t>
       </w:r>
     </w:p>
     <w:p>
@@ -1491,6 +1485,11 @@
     <w:p>
       <w:pPr>
         <w:spacing w:after="200" w:line="276" w:lineRule="auto"/>
+        <w:rPr>
+          <w:rFonts w:ascii="Calibri" w:eastAsia="Calibri" w:hAnsi="Calibri" w:cs="Calibri"/>
+          <w:sz w:val="22"/>
+          <w:szCs w:val="22"/>
+        </w:rPr>
       </w:pPr>
       <w:r>
         <w:rPr>
@@ -1499,6 +1498,67 @@
           <w:szCs w:val="22"/>
         </w:rPr>
         <w:t>Nesta tela também há um botão "Cadastrar-se", que direciona o usuário para a tela de Cadastro, caso ele ainda não possua uma conta.</w:t>
+      </w:r>
+    </w:p>
+    <w:p>
+      <w:pPr>
+        <w:spacing w:after="200" w:line="276" w:lineRule="auto"/>
+      </w:pPr>
+      <w:r>
+        <w:rPr>
+          <w:rFonts w:ascii="Calibri" w:eastAsia="Calibri" w:hAnsi="Calibri" w:cs="Calibri"/>
+          <w:noProof/>
+          <w:sz w:val="22"/>
+          <w:szCs w:val="22"/>
+        </w:rPr>
+        <w:drawing>
+          <wp:inline distT="0" distB="0" distL="0" distR="0" wp14:anchorId="7B7D8617" wp14:editId="547FEDB9">
+            <wp:extent cx="5724525" cy="3076575"/>
+            <wp:effectExtent l="0" t="0" r="9525" b="9525"/>
+            <wp:docPr id="854156441" name="Imagem 1"/>
+            <wp:cNvGraphicFramePr>
+              <a:graphicFrameLocks xmlns:a="http://schemas.openxmlformats.org/drawingml/2006/main" noChangeAspect="1"/>
+            </wp:cNvGraphicFramePr>
+            <a:graphic xmlns:a="http://schemas.openxmlformats.org/drawingml/2006/main">
+              <a:graphicData uri="http://schemas.openxmlformats.org/drawingml/2006/picture">
+                <pic:pic xmlns:pic="http://schemas.openxmlformats.org/drawingml/2006/picture">
+                  <pic:nvPicPr>
+                    <pic:cNvPr id="0" name="Picture 1"/>
+                    <pic:cNvPicPr>
+                      <a:picLocks noChangeAspect="1" noChangeArrowheads="1"/>
+                    </pic:cNvPicPr>
+                  </pic:nvPicPr>
+                  <pic:blipFill>
+                    <a:blip r:embed="rId5" cstate="print">
+                      <a:extLst>
+                        <a:ext uri="{28A0092B-C50C-407E-A947-70E740481C1C}">
+                          <a14:useLocalDpi xmlns:a14="http://schemas.microsoft.com/office/drawing/2010/main" val="0"/>
+                        </a:ext>
+                      </a:extLst>
+                    </a:blip>
+                    <a:srcRect/>
+                    <a:stretch>
+                      <a:fillRect/>
+                    </a:stretch>
+                  </pic:blipFill>
+                  <pic:spPr bwMode="auto">
+                    <a:xfrm>
+                      <a:off x="0" y="0"/>
+                      <a:ext cx="5724525" cy="3076575"/>
+                    </a:xfrm>
+                    <a:prstGeom prst="rect">
+                      <a:avLst/>
+                    </a:prstGeom>
+                    <a:noFill/>
+                    <a:ln>
+                      <a:noFill/>
+                    </a:ln>
+                  </pic:spPr>
+                </pic:pic>
+              </a:graphicData>
+            </a:graphic>
+          </wp:inline>
+        </w:drawing>
       </w:r>
     </w:p>
     <w:p>
@@ -1547,6 +1607,11 @@
     <w:p>
       <w:pPr>
         <w:spacing w:after="200" w:line="276" w:lineRule="auto"/>
+        <w:rPr>
+          <w:rFonts w:ascii="Calibri" w:eastAsia="Calibri" w:hAnsi="Calibri" w:cs="Calibri"/>
+          <w:sz w:val="22"/>
+          <w:szCs w:val="22"/>
+        </w:rPr>
       </w:pPr>
       <w:r>
         <w:rPr>
@@ -1591,6 +1656,68 @@
           <w:szCs w:val="22"/>
         </w:rPr>
         <w:t xml:space="preserve"> redirecionado de volta para a tela de Login.</w:t>
+      </w:r>
+    </w:p>
+    <w:p>
+      <w:pPr>
+        <w:spacing w:after="200" w:line="276" w:lineRule="auto"/>
+      </w:pPr>
+      <w:r>
+        <w:rPr>
+          <w:rFonts w:ascii="Calibri" w:eastAsia="Calibri" w:hAnsi="Calibri" w:cs="Calibri"/>
+          <w:noProof/>
+          <w:sz w:val="22"/>
+          <w:szCs w:val="22"/>
+        </w:rPr>
+        <w:lastRenderedPageBreak/>
+        <w:drawing>
+          <wp:inline distT="0" distB="0" distL="0" distR="0" wp14:anchorId="165B17AD" wp14:editId="1020C706">
+            <wp:extent cx="5734050" cy="3086100"/>
+            <wp:effectExtent l="0" t="0" r="0" b="0"/>
+            <wp:docPr id="1989190311" name="Imagem 2"/>
+            <wp:cNvGraphicFramePr>
+              <a:graphicFrameLocks xmlns:a="http://schemas.openxmlformats.org/drawingml/2006/main" noChangeAspect="1"/>
+            </wp:cNvGraphicFramePr>
+            <a:graphic xmlns:a="http://schemas.openxmlformats.org/drawingml/2006/main">
+              <a:graphicData uri="http://schemas.openxmlformats.org/drawingml/2006/picture">
+                <pic:pic xmlns:pic="http://schemas.openxmlformats.org/drawingml/2006/picture">
+                  <pic:nvPicPr>
+                    <pic:cNvPr id="0" name="Picture 2"/>
+                    <pic:cNvPicPr>
+                      <a:picLocks noChangeAspect="1" noChangeArrowheads="1"/>
+                    </pic:cNvPicPr>
+                  </pic:nvPicPr>
+                  <pic:blipFill>
+                    <a:blip r:embed="rId6" cstate="print">
+                      <a:extLst>
+                        <a:ext uri="{28A0092B-C50C-407E-A947-70E740481C1C}">
+                          <a14:useLocalDpi xmlns:a14="http://schemas.microsoft.com/office/drawing/2010/main" val="0"/>
+                        </a:ext>
+                      </a:extLst>
+                    </a:blip>
+                    <a:srcRect/>
+                    <a:stretch>
+                      <a:fillRect/>
+                    </a:stretch>
+                  </pic:blipFill>
+                  <pic:spPr bwMode="auto">
+                    <a:xfrm>
+                      <a:off x="0" y="0"/>
+                      <a:ext cx="5734050" cy="3086100"/>
+                    </a:xfrm>
+                    <a:prstGeom prst="rect">
+                      <a:avLst/>
+                    </a:prstGeom>
+                    <a:noFill/>
+                    <a:ln>
+                      <a:noFill/>
+                    </a:ln>
+                  </pic:spPr>
+                </pic:pic>
+              </a:graphicData>
+            </a:graphic>
+          </wp:inline>
+        </w:drawing>
       </w:r>
     </w:p>
     <w:p>
@@ -1729,6 +1856,11 @@
     <w:p>
       <w:pPr>
         <w:spacing w:after="200" w:line="276" w:lineRule="auto"/>
+        <w:rPr>
+          <w:rFonts w:ascii="Calibri" w:eastAsia="Calibri" w:hAnsi="Calibri" w:cs="Calibri"/>
+          <w:sz w:val="22"/>
+          <w:szCs w:val="22"/>
+        </w:rPr>
       </w:pPr>
       <w:r>
         <w:rPr>
@@ -1757,6 +1889,69 @@
           <w:szCs w:val="22"/>
         </w:rPr>
         <w:t>().</w:t>
+      </w:r>
+    </w:p>
+    <w:p>
+      <w:pPr>
+        <w:spacing w:after="200" w:line="276" w:lineRule="auto"/>
+        <w:jc w:val="center"/>
+      </w:pPr>
+      <w:r>
+        <w:rPr>
+          <w:rFonts w:ascii="Calibri" w:eastAsia="Calibri" w:hAnsi="Calibri" w:cs="Calibri"/>
+          <w:noProof/>
+          <w:sz w:val="22"/>
+          <w:szCs w:val="22"/>
+        </w:rPr>
+        <w:lastRenderedPageBreak/>
+        <w:drawing>
+          <wp:inline distT="0" distB="0" distL="0" distR="0" wp14:anchorId="780F6CF2" wp14:editId="3F56B096">
+            <wp:extent cx="2047875" cy="7248525"/>
+            <wp:effectExtent l="0" t="0" r="9525" b="9525"/>
+            <wp:docPr id="389696779" name="Imagem 3"/>
+            <wp:cNvGraphicFramePr>
+              <a:graphicFrameLocks xmlns:a="http://schemas.openxmlformats.org/drawingml/2006/main" noChangeAspect="1"/>
+            </wp:cNvGraphicFramePr>
+            <a:graphic xmlns:a="http://schemas.openxmlformats.org/drawingml/2006/main">
+              <a:graphicData uri="http://schemas.openxmlformats.org/drawingml/2006/picture">
+                <pic:pic xmlns:pic="http://schemas.openxmlformats.org/drawingml/2006/picture">
+                  <pic:nvPicPr>
+                    <pic:cNvPr id="0" name="Picture 3"/>
+                    <pic:cNvPicPr>
+                      <a:picLocks noChangeAspect="1" noChangeArrowheads="1"/>
+                    </pic:cNvPicPr>
+                  </pic:nvPicPr>
+                  <pic:blipFill>
+                    <a:blip r:embed="rId7">
+                      <a:extLst>
+                        <a:ext uri="{28A0092B-C50C-407E-A947-70E740481C1C}">
+                          <a14:useLocalDpi xmlns:a14="http://schemas.microsoft.com/office/drawing/2010/main" val="0"/>
+                        </a:ext>
+                      </a:extLst>
+                    </a:blip>
+                    <a:srcRect/>
+                    <a:stretch>
+                      <a:fillRect/>
+                    </a:stretch>
+                  </pic:blipFill>
+                  <pic:spPr bwMode="auto">
+                    <a:xfrm>
+                      <a:off x="0" y="0"/>
+                      <a:ext cx="2047875" cy="7248525"/>
+                    </a:xfrm>
+                    <a:prstGeom prst="rect">
+                      <a:avLst/>
+                    </a:prstGeom>
+                    <a:noFill/>
+                    <a:ln>
+                      <a:noFill/>
+                    </a:ln>
+                  </pic:spPr>
+                </pic:pic>
+              </a:graphicData>
+            </a:graphic>
+          </wp:inline>
+        </w:drawing>
       </w:r>
     </w:p>
     <w:p>
@@ -1779,33 +1974,99 @@
     <w:p>
       <w:pPr>
         <w:spacing w:after="200" w:line="276" w:lineRule="auto"/>
-      </w:pPr>
-      <w:r>
-        <w:rPr>
-          <w:rFonts w:ascii="Calibri" w:eastAsia="Calibri" w:hAnsi="Calibri" w:cs="Calibri"/>
+        <w:rPr>
+          <w:rFonts w:ascii="Calibri" w:eastAsia="Calibri" w:hAnsi="Calibri" w:cs="Calibri"/>
+          <w:sz w:val="22"/>
+          <w:szCs w:val="22"/>
+        </w:rPr>
+      </w:pPr>
+      <w:r>
+        <w:rPr>
+          <w:rFonts w:ascii="Calibri" w:eastAsia="Calibri" w:hAnsi="Calibri" w:cs="Calibri"/>
+          <w:sz w:val="22"/>
+          <w:szCs w:val="22"/>
+        </w:rPr>
+        <w:t xml:space="preserve">É o módulo carregado por padrão ao entrar na tela Home. Exibe uma mensagem de boas-vindas personalizada com o nome do usuário logado (obtido de </w:t>
+      </w:r>
+      <w:proofErr w:type="spellStart"/>
+      <w:r>
+        <w:rPr>
+          <w:rFonts w:ascii="Calibri" w:eastAsia="Calibri" w:hAnsi="Calibri" w:cs="Calibri"/>
+          <w:sz w:val="22"/>
+          <w:szCs w:val="22"/>
+        </w:rPr>
+        <w:t>Sessao.NomeUsuario</w:t>
+      </w:r>
+      <w:proofErr w:type="spellEnd"/>
+      <w:r>
+        <w:rPr>
+          <w:rFonts w:ascii="Calibri" w:eastAsia="Calibri" w:hAnsi="Calibri" w:cs="Calibri"/>
+          <w:sz w:val="22"/>
+          <w:szCs w:val="22"/>
+        </w:rPr>
+        <w:t>).</w:t>
+      </w:r>
+    </w:p>
+    <w:p>
+      <w:pPr>
+        <w:spacing w:after="200" w:line="276" w:lineRule="auto"/>
+      </w:pPr>
+      <w:r>
+        <w:rPr>
+          <w:rFonts w:ascii="Calibri" w:eastAsia="Calibri" w:hAnsi="Calibri" w:cs="Calibri"/>
+          <w:noProof/>
           <w:sz w:val="22"/>
           <w:szCs w:val="22"/>
         </w:rPr>
         <w:lastRenderedPageBreak/>
-        <w:t xml:space="preserve">É o módulo carregado por padrão ao entrar na tela Home. Exibe uma mensagem de boas-vindas personalizada com o nome do usuário logado (obtido de </w:t>
-      </w:r>
-      <w:proofErr w:type="spellStart"/>
-      <w:r>
-        <w:rPr>
-          <w:rFonts w:ascii="Calibri" w:eastAsia="Calibri" w:hAnsi="Calibri" w:cs="Calibri"/>
-          <w:sz w:val="22"/>
-          <w:szCs w:val="22"/>
-        </w:rPr>
-        <w:t>Sessao.NomeUsuario</w:t>
-      </w:r>
-      <w:proofErr w:type="spellEnd"/>
-      <w:r>
-        <w:rPr>
-          <w:rFonts w:ascii="Calibri" w:eastAsia="Calibri" w:hAnsi="Calibri" w:cs="Calibri"/>
-          <w:sz w:val="22"/>
-          <w:szCs w:val="22"/>
-        </w:rPr>
-        <w:t>).</w:t>
+        <w:drawing>
+          <wp:inline distT="0" distB="0" distL="0" distR="0" wp14:anchorId="07325D59" wp14:editId="36EF29BB">
+            <wp:extent cx="5715000" cy="3067050"/>
+            <wp:effectExtent l="0" t="0" r="0" b="0"/>
+            <wp:docPr id="1288967032" name="Imagem 4"/>
+            <wp:cNvGraphicFramePr>
+              <a:graphicFrameLocks xmlns:a="http://schemas.openxmlformats.org/drawingml/2006/main" noChangeAspect="1"/>
+            </wp:cNvGraphicFramePr>
+            <a:graphic xmlns:a="http://schemas.openxmlformats.org/drawingml/2006/main">
+              <a:graphicData uri="http://schemas.openxmlformats.org/drawingml/2006/picture">
+                <pic:pic xmlns:pic="http://schemas.openxmlformats.org/drawingml/2006/picture">
+                  <pic:nvPicPr>
+                    <pic:cNvPr id="0" name="Picture 4"/>
+                    <pic:cNvPicPr>
+                      <a:picLocks noChangeAspect="1" noChangeArrowheads="1"/>
+                    </pic:cNvPicPr>
+                  </pic:nvPicPr>
+                  <pic:blipFill>
+                    <a:blip r:embed="rId8" cstate="print">
+                      <a:extLst>
+                        <a:ext uri="{28A0092B-C50C-407E-A947-70E740481C1C}">
+                          <a14:useLocalDpi xmlns:a14="http://schemas.microsoft.com/office/drawing/2010/main" val="0"/>
+                        </a:ext>
+                      </a:extLst>
+                    </a:blip>
+                    <a:srcRect/>
+                    <a:stretch>
+                      <a:fillRect/>
+                    </a:stretch>
+                  </pic:blipFill>
+                  <pic:spPr bwMode="auto">
+                    <a:xfrm>
+                      <a:off x="0" y="0"/>
+                      <a:ext cx="5715000" cy="3067050"/>
+                    </a:xfrm>
+                    <a:prstGeom prst="rect">
+                      <a:avLst/>
+                    </a:prstGeom>
+                    <a:noFill/>
+                    <a:ln>
+                      <a:noFill/>
+                    </a:ln>
+                  </pic:spPr>
+                </pic:pic>
+              </a:graphicData>
+            </a:graphic>
+          </wp:inline>
+        </w:drawing>
       </w:r>
     </w:p>
     <w:p>
@@ -1997,6 +2258,70 @@
     </w:p>
     <w:p>
       <w:pPr>
+        <w:pStyle w:val="PargrafodaLista"/>
+        <w:spacing w:after="100"/>
+        <w:ind w:left="420"/>
+      </w:pPr>
+      <w:r>
+        <w:rPr>
+          <w:rFonts w:ascii="Calibri" w:eastAsia="Calibri" w:hAnsi="Calibri" w:cs="Calibri"/>
+          <w:noProof/>
+          <w:sz w:val="22"/>
+          <w:szCs w:val="22"/>
+        </w:rPr>
+        <w:lastRenderedPageBreak/>
+        <w:drawing>
+          <wp:inline distT="0" distB="0" distL="0" distR="0" wp14:anchorId="72609E8C" wp14:editId="49B81AF6">
+            <wp:extent cx="5724525" cy="3067050"/>
+            <wp:effectExtent l="0" t="0" r="9525" b="0"/>
+            <wp:docPr id="401782656" name="Imagem 5"/>
+            <wp:cNvGraphicFramePr>
+              <a:graphicFrameLocks xmlns:a="http://schemas.openxmlformats.org/drawingml/2006/main" noChangeAspect="1"/>
+            </wp:cNvGraphicFramePr>
+            <a:graphic xmlns:a="http://schemas.openxmlformats.org/drawingml/2006/main">
+              <a:graphicData uri="http://schemas.openxmlformats.org/drawingml/2006/picture">
+                <pic:pic xmlns:pic="http://schemas.openxmlformats.org/drawingml/2006/picture">
+                  <pic:nvPicPr>
+                    <pic:cNvPr id="0" name="Picture 5"/>
+                    <pic:cNvPicPr>
+                      <a:picLocks noChangeAspect="1" noChangeArrowheads="1"/>
+                    </pic:cNvPicPr>
+                  </pic:nvPicPr>
+                  <pic:blipFill>
+                    <a:blip r:embed="rId9" cstate="print">
+                      <a:extLst>
+                        <a:ext uri="{28A0092B-C50C-407E-A947-70E740481C1C}">
+                          <a14:useLocalDpi xmlns:a14="http://schemas.microsoft.com/office/drawing/2010/main" val="0"/>
+                        </a:ext>
+                      </a:extLst>
+                    </a:blip>
+                    <a:srcRect/>
+                    <a:stretch>
+                      <a:fillRect/>
+                    </a:stretch>
+                  </pic:blipFill>
+                  <pic:spPr bwMode="auto">
+                    <a:xfrm>
+                      <a:off x="0" y="0"/>
+                      <a:ext cx="5724525" cy="3067050"/>
+                    </a:xfrm>
+                    <a:prstGeom prst="rect">
+                      <a:avLst/>
+                    </a:prstGeom>
+                    <a:noFill/>
+                    <a:ln>
+                      <a:noFill/>
+                    </a:ln>
+                  </pic:spPr>
+                </pic:pic>
+              </a:graphicData>
+            </a:graphic>
+          </wp:inline>
+        </w:drawing>
+      </w:r>
+    </w:p>
+    <w:p>
+      <w:pPr>
         <w:pStyle w:val="Ttulo1"/>
         <w:spacing w:before="400" w:after="200"/>
       </w:pPr>
@@ -2135,6 +2460,70 @@
     </w:p>
     <w:p>
       <w:pPr>
+        <w:pStyle w:val="PargrafodaLista"/>
+        <w:spacing w:after="100"/>
+        <w:ind w:left="420"/>
+        <w:jc w:val="center"/>
+      </w:pPr>
+      <w:r>
+        <w:rPr>
+          <w:rFonts w:ascii="Calibri" w:eastAsia="Calibri" w:hAnsi="Calibri" w:cs="Calibri"/>
+          <w:noProof/>
+          <w:sz w:val="22"/>
+          <w:szCs w:val="22"/>
+        </w:rPr>
+        <w:drawing>
+          <wp:inline distT="0" distB="0" distL="0" distR="0" wp14:anchorId="0CFF21A3" wp14:editId="395D41F5">
+            <wp:extent cx="5715000" cy="3086100"/>
+            <wp:effectExtent l="0" t="0" r="0" b="0"/>
+            <wp:docPr id="1492006770" name="Imagem 6"/>
+            <wp:cNvGraphicFramePr>
+              <a:graphicFrameLocks xmlns:a="http://schemas.openxmlformats.org/drawingml/2006/main" noChangeAspect="1"/>
+            </wp:cNvGraphicFramePr>
+            <a:graphic xmlns:a="http://schemas.openxmlformats.org/drawingml/2006/main">
+              <a:graphicData uri="http://schemas.openxmlformats.org/drawingml/2006/picture">
+                <pic:pic xmlns:pic="http://schemas.openxmlformats.org/drawingml/2006/picture">
+                  <pic:nvPicPr>
+                    <pic:cNvPr id="0" name="Picture 6"/>
+                    <pic:cNvPicPr>
+                      <a:picLocks noChangeAspect="1" noChangeArrowheads="1"/>
+                    </pic:cNvPicPr>
+                  </pic:nvPicPr>
+                  <pic:blipFill>
+                    <a:blip r:embed="rId10" cstate="print">
+                      <a:extLst>
+                        <a:ext uri="{28A0092B-C50C-407E-A947-70E740481C1C}">
+                          <a14:useLocalDpi xmlns:a14="http://schemas.microsoft.com/office/drawing/2010/main" val="0"/>
+                        </a:ext>
+                      </a:extLst>
+                    </a:blip>
+                    <a:srcRect/>
+                    <a:stretch>
+                      <a:fillRect/>
+                    </a:stretch>
+                  </pic:blipFill>
+                  <pic:spPr bwMode="auto">
+                    <a:xfrm>
+                      <a:off x="0" y="0"/>
+                      <a:ext cx="5715000" cy="3086100"/>
+                    </a:xfrm>
+                    <a:prstGeom prst="rect">
+                      <a:avLst/>
+                    </a:prstGeom>
+                    <a:noFill/>
+                    <a:ln>
+                      <a:noFill/>
+                    </a:ln>
+                  </pic:spPr>
+                </pic:pic>
+              </a:graphicData>
+            </a:graphic>
+          </wp:inline>
+        </w:drawing>
+      </w:r>
+    </w:p>
+    <w:p>
+      <w:pPr>
         <w:pStyle w:val="Ttulo1"/>
         <w:spacing w:before="400" w:after="200"/>
       </w:pPr>
@@ -2147,6 +2536,7 @@
           <w:sz w:val="26"/>
           <w:szCs w:val="26"/>
         </w:rPr>
+        <w:lastRenderedPageBreak/>
         <w:t>10. Página Notas</w:t>
       </w:r>
     </w:p>
@@ -2264,15 +2654,80 @@
     <w:p>
       <w:pPr>
         <w:spacing w:after="200" w:line="276" w:lineRule="auto"/>
-      </w:pPr>
-      <w:r>
-        <w:rPr>
-          <w:rFonts w:ascii="Calibri" w:eastAsia="Calibri" w:hAnsi="Calibri" w:cs="Calibri"/>
-          <w:sz w:val="22"/>
-          <w:szCs w:val="22"/>
-        </w:rPr>
-        <w:lastRenderedPageBreak/>
+        <w:rPr>
+          <w:rFonts w:ascii="Calibri" w:eastAsia="Calibri" w:hAnsi="Calibri" w:cs="Calibri"/>
+          <w:sz w:val="22"/>
+          <w:szCs w:val="22"/>
+        </w:rPr>
+      </w:pPr>
+      <w:r>
+        <w:rPr>
+          <w:rFonts w:ascii="Calibri" w:eastAsia="Calibri" w:hAnsi="Calibri" w:cs="Calibri"/>
+          <w:sz w:val="22"/>
+          <w:szCs w:val="22"/>
+        </w:rPr>
         <w:t>A página também permite pesquisar notas por nome do aluno.</w:t>
+      </w:r>
+    </w:p>
+    <w:p>
+      <w:pPr>
+        <w:spacing w:after="200" w:line="276" w:lineRule="auto"/>
+      </w:pPr>
+      <w:r>
+        <w:rPr>
+          <w:rFonts w:ascii="Calibri" w:eastAsia="Calibri" w:hAnsi="Calibri" w:cs="Calibri"/>
+          <w:noProof/>
+          <w:sz w:val="22"/>
+          <w:szCs w:val="22"/>
+        </w:rPr>
+        <w:drawing>
+          <wp:inline distT="0" distB="0" distL="0" distR="0" wp14:anchorId="79142578" wp14:editId="04C5F539">
+            <wp:extent cx="5715000" cy="3076575"/>
+            <wp:effectExtent l="0" t="0" r="0" b="9525"/>
+            <wp:docPr id="1208426628" name="Imagem 7"/>
+            <wp:cNvGraphicFramePr>
+              <a:graphicFrameLocks xmlns:a="http://schemas.openxmlformats.org/drawingml/2006/main" noChangeAspect="1"/>
+            </wp:cNvGraphicFramePr>
+            <a:graphic xmlns:a="http://schemas.openxmlformats.org/drawingml/2006/main">
+              <a:graphicData uri="http://schemas.openxmlformats.org/drawingml/2006/picture">
+                <pic:pic xmlns:pic="http://schemas.openxmlformats.org/drawingml/2006/picture">
+                  <pic:nvPicPr>
+                    <pic:cNvPr id="0" name="Picture 7"/>
+                    <pic:cNvPicPr>
+                      <a:picLocks noChangeAspect="1" noChangeArrowheads="1"/>
+                    </pic:cNvPicPr>
+                  </pic:nvPicPr>
+                  <pic:blipFill>
+                    <a:blip r:embed="rId11" cstate="print">
+                      <a:extLst>
+                        <a:ext uri="{28A0092B-C50C-407E-A947-70E740481C1C}">
+                          <a14:useLocalDpi xmlns:a14="http://schemas.microsoft.com/office/drawing/2010/main" val="0"/>
+                        </a:ext>
+                      </a:extLst>
+                    </a:blip>
+                    <a:srcRect/>
+                    <a:stretch>
+                      <a:fillRect/>
+                    </a:stretch>
+                  </pic:blipFill>
+                  <pic:spPr bwMode="auto">
+                    <a:xfrm>
+                      <a:off x="0" y="0"/>
+                      <a:ext cx="5715000" cy="3076575"/>
+                    </a:xfrm>
+                    <a:prstGeom prst="rect">
+                      <a:avLst/>
+                    </a:prstGeom>
+                    <a:noFill/>
+                    <a:ln>
+                      <a:noFill/>
+                    </a:ln>
+                  </pic:spPr>
+                </pic:pic>
+              </a:graphicData>
+            </a:graphic>
+          </wp:inline>
+        </w:drawing>
       </w:r>
     </w:p>
     <w:p>
@@ -2295,6 +2750,11 @@
     <w:p>
       <w:pPr>
         <w:spacing w:after="200" w:line="276" w:lineRule="auto"/>
+        <w:rPr>
+          <w:rFonts w:ascii="Calibri" w:eastAsia="Calibri" w:hAnsi="Calibri" w:cs="Calibri"/>
+          <w:sz w:val="22"/>
+          <w:szCs w:val="22"/>
+        </w:rPr>
       </w:pPr>
       <w:r>
         <w:rPr>
@@ -2321,6 +2781,68 @@
           <w:szCs w:val="22"/>
         </w:rPr>
         <w:t>).</w:t>
+      </w:r>
+    </w:p>
+    <w:p>
+      <w:pPr>
+        <w:spacing w:after="200" w:line="276" w:lineRule="auto"/>
+      </w:pPr>
+      <w:r>
+        <w:rPr>
+          <w:rFonts w:ascii="Calibri" w:eastAsia="Calibri" w:hAnsi="Calibri" w:cs="Calibri"/>
+          <w:noProof/>
+          <w:sz w:val="22"/>
+          <w:szCs w:val="22"/>
+        </w:rPr>
+        <w:lastRenderedPageBreak/>
+        <w:drawing>
+          <wp:inline distT="0" distB="0" distL="0" distR="0" wp14:anchorId="5908A08C" wp14:editId="0BF65921">
+            <wp:extent cx="5715000" cy="3095625"/>
+            <wp:effectExtent l="0" t="0" r="0" b="9525"/>
+            <wp:docPr id="477893113" name="Imagem 8"/>
+            <wp:cNvGraphicFramePr>
+              <a:graphicFrameLocks xmlns:a="http://schemas.openxmlformats.org/drawingml/2006/main" noChangeAspect="1"/>
+            </wp:cNvGraphicFramePr>
+            <a:graphic xmlns:a="http://schemas.openxmlformats.org/drawingml/2006/main">
+              <a:graphicData uri="http://schemas.openxmlformats.org/drawingml/2006/picture">
+                <pic:pic xmlns:pic="http://schemas.openxmlformats.org/drawingml/2006/picture">
+                  <pic:nvPicPr>
+                    <pic:cNvPr id="0" name="Picture 8"/>
+                    <pic:cNvPicPr>
+                      <a:picLocks noChangeAspect="1" noChangeArrowheads="1"/>
+                    </pic:cNvPicPr>
+                  </pic:nvPicPr>
+                  <pic:blipFill>
+                    <a:blip r:embed="rId12" cstate="print">
+                      <a:extLst>
+                        <a:ext uri="{28A0092B-C50C-407E-A947-70E740481C1C}">
+                          <a14:useLocalDpi xmlns:a14="http://schemas.microsoft.com/office/drawing/2010/main" val="0"/>
+                        </a:ext>
+                      </a:extLst>
+                    </a:blip>
+                    <a:srcRect/>
+                    <a:stretch>
+                      <a:fillRect/>
+                    </a:stretch>
+                  </pic:blipFill>
+                  <pic:spPr bwMode="auto">
+                    <a:xfrm>
+                      <a:off x="0" y="0"/>
+                      <a:ext cx="5715000" cy="3095625"/>
+                    </a:xfrm>
+                    <a:prstGeom prst="rect">
+                      <a:avLst/>
+                    </a:prstGeom>
+                    <a:noFill/>
+                    <a:ln>
+                      <a:noFill/>
+                    </a:ln>
+                  </pic:spPr>
+                </pic:pic>
+              </a:graphicData>
+            </a:graphic>
+          </wp:inline>
+        </w:drawing>
       </w:r>
     </w:p>
     <w:p>
@@ -2337,7 +2859,7 @@
           <w:sz w:val="26"/>
           <w:szCs w:val="26"/>
         </w:rPr>
-        <w:t>12. Página Configurações (Tema Claro/Escuro)</w:t>
+        <w:t xml:space="preserve">12. Página Configurações </w:t>
       </w:r>
     </w:p>
     <w:p>
@@ -2423,6 +2945,11 @@
     <w:p>
       <w:pPr>
         <w:spacing w:after="200" w:line="276" w:lineRule="auto"/>
+        <w:rPr>
+          <w:rFonts w:ascii="Calibri" w:eastAsia="Calibri" w:hAnsi="Calibri" w:cs="Calibri"/>
+          <w:sz w:val="22"/>
+          <w:szCs w:val="22"/>
+        </w:rPr>
       </w:pPr>
       <w:r>
         <w:rPr>
@@ -2467,6 +2994,67 @@
           <w:szCs w:val="22"/>
         </w:rPr>
         <w:t>), evitando que o usuário precise selecionar o tema novamente a cada execução.</w:t>
+      </w:r>
+    </w:p>
+    <w:p>
+      <w:pPr>
+        <w:spacing w:after="200" w:line="276" w:lineRule="auto"/>
+      </w:pPr>
+      <w:r>
+        <w:rPr>
+          <w:rFonts w:ascii="Calibri" w:eastAsia="Calibri" w:hAnsi="Calibri" w:cs="Calibri"/>
+          <w:noProof/>
+          <w:sz w:val="22"/>
+          <w:szCs w:val="22"/>
+        </w:rPr>
+        <w:drawing>
+          <wp:inline distT="0" distB="0" distL="0" distR="0" wp14:anchorId="3400E291" wp14:editId="07E58A46">
+            <wp:extent cx="5715000" cy="3076575"/>
+            <wp:effectExtent l="0" t="0" r="0" b="9525"/>
+            <wp:docPr id="293997370" name="Imagem 9"/>
+            <wp:cNvGraphicFramePr>
+              <a:graphicFrameLocks xmlns:a="http://schemas.openxmlformats.org/drawingml/2006/main" noChangeAspect="1"/>
+            </wp:cNvGraphicFramePr>
+            <a:graphic xmlns:a="http://schemas.openxmlformats.org/drawingml/2006/main">
+              <a:graphicData uri="http://schemas.openxmlformats.org/drawingml/2006/picture">
+                <pic:pic xmlns:pic="http://schemas.openxmlformats.org/drawingml/2006/picture">
+                  <pic:nvPicPr>
+                    <pic:cNvPr id="0" name="Picture 9"/>
+                    <pic:cNvPicPr>
+                      <a:picLocks noChangeAspect="1" noChangeArrowheads="1"/>
+                    </pic:cNvPicPr>
+                  </pic:nvPicPr>
+                  <pic:blipFill>
+                    <a:blip r:embed="rId13" cstate="print">
+                      <a:extLst>
+                        <a:ext uri="{28A0092B-C50C-407E-A947-70E740481C1C}">
+                          <a14:useLocalDpi xmlns:a14="http://schemas.microsoft.com/office/drawing/2010/main" val="0"/>
+                        </a:ext>
+                      </a:extLst>
+                    </a:blip>
+                    <a:srcRect/>
+                    <a:stretch>
+                      <a:fillRect/>
+                    </a:stretch>
+                  </pic:blipFill>
+                  <pic:spPr bwMode="auto">
+                    <a:xfrm>
+                      <a:off x="0" y="0"/>
+                      <a:ext cx="5715000" cy="3076575"/>
+                    </a:xfrm>
+                    <a:prstGeom prst="rect">
+                      <a:avLst/>
+                    </a:prstGeom>
+                    <a:noFill/>
+                    <a:ln>
+                      <a:noFill/>
+                    </a:ln>
+                  </pic:spPr>
+                </pic:pic>
+              </a:graphicData>
+            </a:graphic>
+          </wp:inline>
+        </w:drawing>
       </w:r>
     </w:p>
     <w:p>
@@ -2483,743 +3071,9 @@
           <w:sz w:val="26"/>
           <w:szCs w:val="26"/>
         </w:rPr>
-        <w:t>13. Estrutura do Banco de Dados</w:t>
-      </w:r>
-    </w:p>
-    <w:p>
-      <w:pPr>
-        <w:spacing w:after="200" w:line="276" w:lineRule="auto"/>
-      </w:pPr>
-      <w:r>
-        <w:rPr>
-          <w:rFonts w:ascii="Calibri" w:eastAsia="Calibri" w:hAnsi="Calibri" w:cs="Calibri"/>
-          <w:sz w:val="22"/>
-          <w:szCs w:val="22"/>
-        </w:rPr>
-        <w:t>O sistema utiliza um banco de dados MySQL chamado "escola", composto pelas seguintes tabelas principais:</w:t>
-      </w:r>
-    </w:p>
-    <w:p>
-      <w:pPr>
-        <w:pStyle w:val="Ttulo2"/>
-        <w:spacing w:before="200" w:after="120"/>
-      </w:pPr>
-      <w:r>
-        <w:rPr>
-          <w:rFonts w:ascii="Calibri" w:eastAsia="Calibri" w:hAnsi="Calibri" w:cs="Calibri"/>
-          <w:b/>
-          <w:bCs/>
-          <w:color w:val="2E75B6"/>
-          <w:sz w:val="23"/>
-          <w:szCs w:val="23"/>
-        </w:rPr>
-        <w:t xml:space="preserve">13.1 Tabela </w:t>
-      </w:r>
-      <w:proofErr w:type="spellStart"/>
-      <w:r>
-        <w:rPr>
-          <w:rFonts w:ascii="Calibri" w:eastAsia="Calibri" w:hAnsi="Calibri" w:cs="Calibri"/>
-          <w:b/>
-          <w:bCs/>
-          <w:color w:val="2E75B6"/>
-          <w:sz w:val="23"/>
-          <w:szCs w:val="23"/>
-        </w:rPr>
-        <w:t>usuarios</w:t>
-      </w:r>
-      <w:proofErr w:type="spellEnd"/>
-    </w:p>
-    <w:p>
-      <w:pPr>
-        <w:spacing w:after="200" w:line="276" w:lineRule="auto"/>
-      </w:pPr>
-      <w:r>
-        <w:rPr>
-          <w:rFonts w:ascii="Calibri" w:eastAsia="Calibri" w:hAnsi="Calibri" w:cs="Calibri"/>
-          <w:sz w:val="22"/>
-          <w:szCs w:val="22"/>
-        </w:rPr>
-        <w:t>Armazena os usuários administradores do sistema (login e cadastro).</w:t>
-      </w:r>
-    </w:p>
-    <w:p>
-      <w:pPr>
-        <w:shd w:val="clear" w:color="auto" w:fill="F2F2F2"/>
-      </w:pPr>
-      <w:proofErr w:type="spellStart"/>
-      <w:r>
-        <w:rPr>
-          <w:rFonts w:ascii="Consolas" w:eastAsia="Consolas" w:hAnsi="Consolas" w:cs="Consolas"/>
-          <w:sz w:val="19"/>
-          <w:szCs w:val="19"/>
-        </w:rPr>
-        <w:t>Id_user</w:t>
-      </w:r>
-      <w:proofErr w:type="spellEnd"/>
-      <w:r>
-        <w:rPr>
-          <w:rFonts w:ascii="Consolas" w:eastAsia="Consolas" w:hAnsi="Consolas" w:cs="Consolas"/>
-          <w:sz w:val="19"/>
-          <w:szCs w:val="19"/>
-        </w:rPr>
-        <w:t xml:space="preserve"> (PK, </w:t>
-      </w:r>
-      <w:proofErr w:type="gramStart"/>
-      <w:r>
-        <w:rPr>
-          <w:rFonts w:ascii="Consolas" w:eastAsia="Consolas" w:hAnsi="Consolas" w:cs="Consolas"/>
-          <w:sz w:val="19"/>
-          <w:szCs w:val="19"/>
-        </w:rPr>
-        <w:t>auto incremento</w:t>
-      </w:r>
-      <w:proofErr w:type="gramEnd"/>
-      <w:r>
-        <w:rPr>
-          <w:rFonts w:ascii="Consolas" w:eastAsia="Consolas" w:hAnsi="Consolas" w:cs="Consolas"/>
-          <w:sz w:val="19"/>
-          <w:szCs w:val="19"/>
-        </w:rPr>
-        <w:t>)</w:t>
-      </w:r>
-    </w:p>
-    <w:p>
-      <w:pPr>
-        <w:shd w:val="clear" w:color="auto" w:fill="F2F2F2"/>
-      </w:pPr>
-      <w:proofErr w:type="spellStart"/>
-      <w:r>
-        <w:rPr>
-          <w:rFonts w:ascii="Consolas" w:eastAsia="Consolas" w:hAnsi="Consolas" w:cs="Consolas"/>
-          <w:sz w:val="19"/>
-          <w:szCs w:val="19"/>
-        </w:rPr>
-        <w:t>Nome_user</w:t>
-      </w:r>
-      <w:proofErr w:type="spellEnd"/>
-    </w:p>
-    <w:p>
-      <w:pPr>
-        <w:shd w:val="clear" w:color="auto" w:fill="F2F2F2"/>
-      </w:pPr>
-      <w:r>
-        <w:rPr>
-          <w:rFonts w:ascii="Consolas" w:eastAsia="Consolas" w:hAnsi="Consolas" w:cs="Consolas"/>
-          <w:sz w:val="19"/>
-          <w:szCs w:val="19"/>
-        </w:rPr>
-        <w:t>Email (único)</w:t>
-      </w:r>
-    </w:p>
-    <w:p>
-      <w:pPr>
-        <w:shd w:val="clear" w:color="auto" w:fill="F2F2F2"/>
-      </w:pPr>
-      <w:r>
-        <w:rPr>
-          <w:rFonts w:ascii="Consolas" w:eastAsia="Consolas" w:hAnsi="Consolas" w:cs="Consolas"/>
-          <w:sz w:val="19"/>
-          <w:szCs w:val="19"/>
-        </w:rPr>
-        <w:t>CPF (único)</w:t>
-      </w:r>
-    </w:p>
-    <w:p>
-      <w:pPr>
-        <w:shd w:val="clear" w:color="auto" w:fill="F2F2F2"/>
-      </w:pPr>
-      <w:r>
-        <w:rPr>
-          <w:rFonts w:ascii="Consolas" w:eastAsia="Consolas" w:hAnsi="Consolas" w:cs="Consolas"/>
-          <w:sz w:val="19"/>
-          <w:szCs w:val="19"/>
-        </w:rPr>
-        <w:t>Senha</w:t>
-      </w:r>
-    </w:p>
-    <w:p>
-      <w:pPr>
-        <w:shd w:val="clear" w:color="auto" w:fill="F2F2F2"/>
-      </w:pPr>
-      <w:proofErr w:type="spellStart"/>
-      <w:r>
-        <w:rPr>
-          <w:rFonts w:ascii="Consolas" w:eastAsia="Consolas" w:hAnsi="Consolas" w:cs="Consolas"/>
-          <w:sz w:val="19"/>
-          <w:szCs w:val="19"/>
-        </w:rPr>
-        <w:t>Data_criacao</w:t>
-      </w:r>
-      <w:proofErr w:type="spellEnd"/>
-    </w:p>
-    <w:p>
-      <w:pPr>
-        <w:pStyle w:val="Ttulo2"/>
-        <w:spacing w:before="200" w:after="120"/>
-      </w:pPr>
-      <w:r>
-        <w:rPr>
-          <w:rFonts w:ascii="Calibri" w:eastAsia="Calibri" w:hAnsi="Calibri" w:cs="Calibri"/>
-          <w:b/>
-          <w:bCs/>
-          <w:color w:val="2E75B6"/>
-          <w:sz w:val="23"/>
-          <w:szCs w:val="23"/>
-        </w:rPr>
-        <w:t>13.2 Tabela alunos</w:t>
-      </w:r>
-    </w:p>
-    <w:p>
-      <w:pPr>
-        <w:spacing w:after="200" w:line="276" w:lineRule="auto"/>
-      </w:pPr>
-      <w:r>
-        <w:rPr>
-          <w:rFonts w:ascii="Calibri" w:eastAsia="Calibri" w:hAnsi="Calibri" w:cs="Calibri"/>
-          <w:sz w:val="22"/>
-          <w:szCs w:val="22"/>
-        </w:rPr>
-        <w:t>Armazena os dados dos alunos cadastrados.</w:t>
-      </w:r>
-    </w:p>
-    <w:p>
-      <w:pPr>
-        <w:shd w:val="clear" w:color="auto" w:fill="F2F2F2"/>
-      </w:pPr>
-      <w:proofErr w:type="spellStart"/>
-      <w:r>
-        <w:rPr>
-          <w:rFonts w:ascii="Consolas" w:eastAsia="Consolas" w:hAnsi="Consolas" w:cs="Consolas"/>
-          <w:sz w:val="19"/>
-          <w:szCs w:val="19"/>
-        </w:rPr>
-        <w:t>Id_aluno</w:t>
-      </w:r>
-      <w:proofErr w:type="spellEnd"/>
-      <w:r>
-        <w:rPr>
-          <w:rFonts w:ascii="Consolas" w:eastAsia="Consolas" w:hAnsi="Consolas" w:cs="Consolas"/>
-          <w:sz w:val="19"/>
-          <w:szCs w:val="19"/>
-        </w:rPr>
-        <w:t xml:space="preserve"> (PK, </w:t>
-      </w:r>
-      <w:proofErr w:type="gramStart"/>
-      <w:r>
-        <w:rPr>
-          <w:rFonts w:ascii="Consolas" w:eastAsia="Consolas" w:hAnsi="Consolas" w:cs="Consolas"/>
-          <w:sz w:val="19"/>
-          <w:szCs w:val="19"/>
-        </w:rPr>
-        <w:t>auto incremento</w:t>
-      </w:r>
-      <w:proofErr w:type="gramEnd"/>
-      <w:r>
-        <w:rPr>
-          <w:rFonts w:ascii="Consolas" w:eastAsia="Consolas" w:hAnsi="Consolas" w:cs="Consolas"/>
-          <w:sz w:val="19"/>
-          <w:szCs w:val="19"/>
-        </w:rPr>
-        <w:t>)</w:t>
-      </w:r>
-    </w:p>
-    <w:p>
-      <w:pPr>
-        <w:shd w:val="clear" w:color="auto" w:fill="F2F2F2"/>
-      </w:pPr>
-      <w:r>
-        <w:rPr>
-          <w:rFonts w:ascii="Consolas" w:eastAsia="Consolas" w:hAnsi="Consolas" w:cs="Consolas"/>
-          <w:sz w:val="19"/>
-          <w:szCs w:val="19"/>
-        </w:rPr>
-        <w:t>Nome</w:t>
-      </w:r>
-    </w:p>
-    <w:p>
-      <w:pPr>
-        <w:shd w:val="clear" w:color="auto" w:fill="F2F2F2"/>
-      </w:pPr>
-      <w:r>
-        <w:rPr>
-          <w:rFonts w:ascii="Consolas" w:eastAsia="Consolas" w:hAnsi="Consolas" w:cs="Consolas"/>
-          <w:sz w:val="19"/>
-          <w:szCs w:val="19"/>
-        </w:rPr>
-        <w:t>Email</w:t>
-      </w:r>
-    </w:p>
-    <w:p>
-      <w:pPr>
-        <w:shd w:val="clear" w:color="auto" w:fill="F2F2F2"/>
-      </w:pPr>
-      <w:r>
-        <w:rPr>
-          <w:rFonts w:ascii="Consolas" w:eastAsia="Consolas" w:hAnsi="Consolas" w:cs="Consolas"/>
-          <w:sz w:val="19"/>
-          <w:szCs w:val="19"/>
-        </w:rPr>
-        <w:t>Senha</w:t>
-      </w:r>
-    </w:p>
-    <w:p>
-      <w:pPr>
-        <w:shd w:val="clear" w:color="auto" w:fill="F2F2F2"/>
-      </w:pPr>
-      <w:r>
-        <w:rPr>
-          <w:rFonts w:ascii="Consolas" w:eastAsia="Consolas" w:hAnsi="Consolas" w:cs="Consolas"/>
-          <w:sz w:val="19"/>
-          <w:szCs w:val="19"/>
-        </w:rPr>
-        <w:t>idade</w:t>
-      </w:r>
-    </w:p>
-    <w:p>
-      <w:pPr>
-        <w:shd w:val="clear" w:color="auto" w:fill="F2F2F2"/>
-      </w:pPr>
-      <w:r>
-        <w:rPr>
-          <w:rFonts w:ascii="Consolas" w:eastAsia="Consolas" w:hAnsi="Consolas" w:cs="Consolas"/>
-          <w:sz w:val="19"/>
-          <w:szCs w:val="19"/>
-        </w:rPr>
-        <w:t>CPF</w:t>
-      </w:r>
-    </w:p>
-    <w:p>
-      <w:pPr>
-        <w:shd w:val="clear" w:color="auto" w:fill="F2F2F2"/>
-      </w:pPr>
-      <w:r>
-        <w:rPr>
-          <w:rFonts w:ascii="Consolas" w:eastAsia="Consolas" w:hAnsi="Consolas" w:cs="Consolas"/>
-          <w:sz w:val="19"/>
-          <w:szCs w:val="19"/>
-        </w:rPr>
-        <w:t>Turma</w:t>
-      </w:r>
-    </w:p>
-    <w:p>
-      <w:pPr>
-        <w:shd w:val="clear" w:color="auto" w:fill="F2F2F2"/>
-      </w:pPr>
-      <w:proofErr w:type="spellStart"/>
-      <w:r>
-        <w:rPr>
-          <w:rFonts w:ascii="Consolas" w:eastAsia="Consolas" w:hAnsi="Consolas" w:cs="Consolas"/>
-          <w:sz w:val="19"/>
-          <w:szCs w:val="19"/>
-        </w:rPr>
-        <w:t>Data_criacao</w:t>
-      </w:r>
-      <w:proofErr w:type="spellEnd"/>
-    </w:p>
-    <w:p>
-      <w:pPr>
-        <w:pStyle w:val="Ttulo2"/>
-        <w:spacing w:before="200" w:after="120"/>
-      </w:pPr>
-      <w:r>
-        <w:rPr>
-          <w:rFonts w:ascii="Calibri" w:eastAsia="Calibri" w:hAnsi="Calibri" w:cs="Calibri"/>
-          <w:b/>
-          <w:bCs/>
-          <w:color w:val="2E75B6"/>
-          <w:sz w:val="23"/>
-          <w:szCs w:val="23"/>
-        </w:rPr>
-        <w:t>13.3 Tabela professores</w:t>
-      </w:r>
-    </w:p>
-    <w:p>
-      <w:pPr>
-        <w:spacing w:after="200" w:line="276" w:lineRule="auto"/>
-      </w:pPr>
-      <w:r>
-        <w:rPr>
-          <w:rFonts w:ascii="Calibri" w:eastAsia="Calibri" w:hAnsi="Calibri" w:cs="Calibri"/>
-          <w:sz w:val="22"/>
-          <w:szCs w:val="22"/>
-        </w:rPr>
-        <w:t>Armazena os dados dos professores cadastrados.</w:t>
-      </w:r>
-    </w:p>
-    <w:p>
-      <w:pPr>
-        <w:shd w:val="clear" w:color="auto" w:fill="F2F2F2"/>
-      </w:pPr>
-      <w:proofErr w:type="spellStart"/>
-      <w:r>
-        <w:rPr>
-          <w:rFonts w:ascii="Consolas" w:eastAsia="Consolas" w:hAnsi="Consolas" w:cs="Consolas"/>
-          <w:sz w:val="19"/>
-          <w:szCs w:val="19"/>
-        </w:rPr>
         <w:lastRenderedPageBreak/>
-        <w:t>Id_prof</w:t>
-      </w:r>
-      <w:proofErr w:type="spellEnd"/>
-      <w:r>
-        <w:rPr>
-          <w:rFonts w:ascii="Consolas" w:eastAsia="Consolas" w:hAnsi="Consolas" w:cs="Consolas"/>
-          <w:sz w:val="19"/>
-          <w:szCs w:val="19"/>
-        </w:rPr>
-        <w:t xml:space="preserve"> (PK, </w:t>
-      </w:r>
-      <w:proofErr w:type="gramStart"/>
-      <w:r>
-        <w:rPr>
-          <w:rFonts w:ascii="Consolas" w:eastAsia="Consolas" w:hAnsi="Consolas" w:cs="Consolas"/>
-          <w:sz w:val="19"/>
-          <w:szCs w:val="19"/>
-        </w:rPr>
-        <w:t>auto incremento</w:t>
-      </w:r>
-      <w:proofErr w:type="gramEnd"/>
-      <w:r>
-        <w:rPr>
-          <w:rFonts w:ascii="Consolas" w:eastAsia="Consolas" w:hAnsi="Consolas" w:cs="Consolas"/>
-          <w:sz w:val="19"/>
-          <w:szCs w:val="19"/>
-        </w:rPr>
-        <w:t>)</w:t>
-      </w:r>
-    </w:p>
-    <w:p>
-      <w:pPr>
-        <w:shd w:val="clear" w:color="auto" w:fill="F2F2F2"/>
-      </w:pPr>
-      <w:proofErr w:type="spellStart"/>
-      <w:r>
-        <w:rPr>
-          <w:rFonts w:ascii="Consolas" w:eastAsia="Consolas" w:hAnsi="Consolas" w:cs="Consolas"/>
-          <w:sz w:val="19"/>
-          <w:szCs w:val="19"/>
-        </w:rPr>
-        <w:t>Nome_prof</w:t>
-      </w:r>
-      <w:proofErr w:type="spellEnd"/>
-    </w:p>
-    <w:p>
-      <w:pPr>
-        <w:shd w:val="clear" w:color="auto" w:fill="F2F2F2"/>
-      </w:pPr>
-      <w:r>
-        <w:rPr>
-          <w:rFonts w:ascii="Consolas" w:eastAsia="Consolas" w:hAnsi="Consolas" w:cs="Consolas"/>
-          <w:sz w:val="19"/>
-          <w:szCs w:val="19"/>
-        </w:rPr>
-        <w:t>Email (único)</w:t>
-      </w:r>
-    </w:p>
-    <w:p>
-      <w:pPr>
-        <w:shd w:val="clear" w:color="auto" w:fill="F2F2F2"/>
-      </w:pPr>
-      <w:r>
-        <w:rPr>
-          <w:rFonts w:ascii="Consolas" w:eastAsia="Consolas" w:hAnsi="Consolas" w:cs="Consolas"/>
-          <w:sz w:val="19"/>
-          <w:szCs w:val="19"/>
-        </w:rPr>
-        <w:t>Telefone (único)</w:t>
-      </w:r>
-    </w:p>
-    <w:p>
-      <w:pPr>
-        <w:shd w:val="clear" w:color="auto" w:fill="F2F2F2"/>
-      </w:pPr>
-      <w:r>
-        <w:rPr>
-          <w:rFonts w:ascii="Consolas" w:eastAsia="Consolas" w:hAnsi="Consolas" w:cs="Consolas"/>
-          <w:sz w:val="19"/>
-          <w:szCs w:val="19"/>
-        </w:rPr>
-        <w:t>CPF (único)</w:t>
-      </w:r>
-    </w:p>
-    <w:p>
-      <w:pPr>
-        <w:shd w:val="clear" w:color="auto" w:fill="F2F2F2"/>
-      </w:pPr>
-      <w:proofErr w:type="spellStart"/>
-      <w:r>
-        <w:rPr>
-          <w:rFonts w:ascii="Consolas" w:eastAsia="Consolas" w:hAnsi="Consolas" w:cs="Consolas"/>
-          <w:sz w:val="19"/>
-          <w:szCs w:val="19"/>
-        </w:rPr>
-        <w:t>Formacao</w:t>
-      </w:r>
-      <w:proofErr w:type="spellEnd"/>
-    </w:p>
-    <w:p>
-      <w:pPr>
-        <w:shd w:val="clear" w:color="auto" w:fill="F2F2F2"/>
-      </w:pPr>
-      <w:r>
-        <w:rPr>
-          <w:rFonts w:ascii="Consolas" w:eastAsia="Consolas" w:hAnsi="Consolas" w:cs="Consolas"/>
-          <w:sz w:val="19"/>
-          <w:szCs w:val="19"/>
-        </w:rPr>
-        <w:t>Disciplina</w:t>
-      </w:r>
-    </w:p>
-    <w:p>
-      <w:pPr>
-        <w:shd w:val="clear" w:color="auto" w:fill="F2F2F2"/>
-      </w:pPr>
-      <w:r>
-        <w:rPr>
-          <w:rFonts w:ascii="Consolas" w:eastAsia="Consolas" w:hAnsi="Consolas" w:cs="Consolas"/>
-          <w:sz w:val="19"/>
-          <w:szCs w:val="19"/>
-        </w:rPr>
-        <w:t>Senha</w:t>
-      </w:r>
-    </w:p>
-    <w:p>
-      <w:pPr>
-        <w:pStyle w:val="Ttulo2"/>
-        <w:spacing w:before="200" w:after="120"/>
-      </w:pPr>
-      <w:r>
-        <w:rPr>
-          <w:rFonts w:ascii="Calibri" w:eastAsia="Calibri" w:hAnsi="Calibri" w:cs="Calibri"/>
-          <w:b/>
-          <w:bCs/>
-          <w:color w:val="2E75B6"/>
-          <w:sz w:val="23"/>
-          <w:szCs w:val="23"/>
-        </w:rPr>
-        <w:t>13.4 Tabela notas</w:t>
-      </w:r>
-    </w:p>
-    <w:p>
-      <w:pPr>
-        <w:spacing w:after="200" w:line="276" w:lineRule="auto"/>
-      </w:pPr>
-      <w:r>
-        <w:rPr>
-          <w:rFonts w:ascii="Calibri" w:eastAsia="Calibri" w:hAnsi="Calibri" w:cs="Calibri"/>
-          <w:sz w:val="22"/>
-          <w:szCs w:val="22"/>
-        </w:rPr>
-        <w:t>Armazena as notas lançadas para cada aluno, vinculadas por chave estrangeira.</w:t>
-      </w:r>
-    </w:p>
-    <w:p>
-      <w:pPr>
-        <w:shd w:val="clear" w:color="auto" w:fill="F2F2F2"/>
-      </w:pPr>
-      <w:proofErr w:type="spellStart"/>
-      <w:r>
-        <w:rPr>
-          <w:rFonts w:ascii="Consolas" w:eastAsia="Consolas" w:hAnsi="Consolas" w:cs="Consolas"/>
-          <w:sz w:val="19"/>
-          <w:szCs w:val="19"/>
-        </w:rPr>
-        <w:t>Id_nota</w:t>
-      </w:r>
-      <w:proofErr w:type="spellEnd"/>
-      <w:r>
-        <w:rPr>
-          <w:rFonts w:ascii="Consolas" w:eastAsia="Consolas" w:hAnsi="Consolas" w:cs="Consolas"/>
-          <w:sz w:val="19"/>
-          <w:szCs w:val="19"/>
-        </w:rPr>
-        <w:t xml:space="preserve"> (PK, </w:t>
-      </w:r>
-      <w:proofErr w:type="gramStart"/>
-      <w:r>
-        <w:rPr>
-          <w:rFonts w:ascii="Consolas" w:eastAsia="Consolas" w:hAnsi="Consolas" w:cs="Consolas"/>
-          <w:sz w:val="19"/>
-          <w:szCs w:val="19"/>
-        </w:rPr>
-        <w:t>auto incremento</w:t>
-      </w:r>
-      <w:proofErr w:type="gramEnd"/>
-      <w:r>
-        <w:rPr>
-          <w:rFonts w:ascii="Consolas" w:eastAsia="Consolas" w:hAnsi="Consolas" w:cs="Consolas"/>
-          <w:sz w:val="19"/>
-          <w:szCs w:val="19"/>
-        </w:rPr>
-        <w:t>)</w:t>
-      </w:r>
-    </w:p>
-    <w:p>
-      <w:pPr>
-        <w:shd w:val="clear" w:color="auto" w:fill="F2F2F2"/>
-      </w:pPr>
-      <w:proofErr w:type="spellStart"/>
-      <w:r>
-        <w:rPr>
-          <w:rFonts w:ascii="Consolas" w:eastAsia="Consolas" w:hAnsi="Consolas" w:cs="Consolas"/>
-          <w:sz w:val="19"/>
-          <w:szCs w:val="19"/>
-        </w:rPr>
-        <w:t>Id_aluno</w:t>
-      </w:r>
-      <w:proofErr w:type="spellEnd"/>
-      <w:r>
-        <w:rPr>
-          <w:rFonts w:ascii="Consolas" w:eastAsia="Consolas" w:hAnsi="Consolas" w:cs="Consolas"/>
-          <w:sz w:val="19"/>
-          <w:szCs w:val="19"/>
-        </w:rPr>
-        <w:t xml:space="preserve"> (FK -&gt; </w:t>
-      </w:r>
-      <w:proofErr w:type="spellStart"/>
-      <w:proofErr w:type="gramStart"/>
-      <w:r>
-        <w:rPr>
-          <w:rFonts w:ascii="Consolas" w:eastAsia="Consolas" w:hAnsi="Consolas" w:cs="Consolas"/>
-          <w:sz w:val="19"/>
-          <w:szCs w:val="19"/>
-        </w:rPr>
-        <w:t>alunos.Id</w:t>
-      </w:r>
-      <w:proofErr w:type="gramEnd"/>
-      <w:r>
-        <w:rPr>
-          <w:rFonts w:ascii="Consolas" w:eastAsia="Consolas" w:hAnsi="Consolas" w:cs="Consolas"/>
-          <w:sz w:val="19"/>
-          <w:szCs w:val="19"/>
-        </w:rPr>
-        <w:t>_aluno</w:t>
-      </w:r>
-      <w:proofErr w:type="spellEnd"/>
-      <w:r>
-        <w:rPr>
-          <w:rFonts w:ascii="Consolas" w:eastAsia="Consolas" w:hAnsi="Consolas" w:cs="Consolas"/>
-          <w:sz w:val="19"/>
-          <w:szCs w:val="19"/>
-        </w:rPr>
-        <w:t>)</w:t>
-      </w:r>
-    </w:p>
-    <w:p>
-      <w:pPr>
-        <w:shd w:val="clear" w:color="auto" w:fill="F2F2F2"/>
-      </w:pPr>
-      <w:proofErr w:type="spellStart"/>
-      <w:r>
-        <w:rPr>
-          <w:rFonts w:ascii="Consolas" w:eastAsia="Consolas" w:hAnsi="Consolas" w:cs="Consolas"/>
-          <w:sz w:val="19"/>
-          <w:szCs w:val="19"/>
-        </w:rPr>
-        <w:t>Matematica</w:t>
-      </w:r>
-      <w:proofErr w:type="spellEnd"/>
-      <w:r>
-        <w:rPr>
-          <w:rFonts w:ascii="Consolas" w:eastAsia="Consolas" w:hAnsi="Consolas" w:cs="Consolas"/>
-          <w:sz w:val="19"/>
-          <w:szCs w:val="19"/>
-        </w:rPr>
-        <w:t xml:space="preserve">, </w:t>
-      </w:r>
-      <w:proofErr w:type="spellStart"/>
-      <w:r>
-        <w:rPr>
-          <w:rFonts w:ascii="Consolas" w:eastAsia="Consolas" w:hAnsi="Consolas" w:cs="Consolas"/>
-          <w:sz w:val="19"/>
-          <w:szCs w:val="19"/>
-        </w:rPr>
-        <w:t>Portugues</w:t>
-      </w:r>
-      <w:proofErr w:type="spellEnd"/>
-      <w:r>
-        <w:rPr>
-          <w:rFonts w:ascii="Consolas" w:eastAsia="Consolas" w:hAnsi="Consolas" w:cs="Consolas"/>
-          <w:sz w:val="19"/>
-          <w:szCs w:val="19"/>
-        </w:rPr>
-        <w:t xml:space="preserve">, </w:t>
-      </w:r>
-      <w:proofErr w:type="spellStart"/>
-      <w:r>
-        <w:rPr>
-          <w:rFonts w:ascii="Consolas" w:eastAsia="Consolas" w:hAnsi="Consolas" w:cs="Consolas"/>
-          <w:sz w:val="19"/>
-          <w:szCs w:val="19"/>
-        </w:rPr>
-        <w:t>Ciencias</w:t>
-      </w:r>
-      <w:proofErr w:type="spellEnd"/>
-      <w:r>
-        <w:rPr>
-          <w:rFonts w:ascii="Consolas" w:eastAsia="Consolas" w:hAnsi="Consolas" w:cs="Consolas"/>
-          <w:sz w:val="19"/>
-          <w:szCs w:val="19"/>
-        </w:rPr>
-        <w:t xml:space="preserve">, </w:t>
-      </w:r>
-      <w:proofErr w:type="spellStart"/>
-      <w:r>
-        <w:rPr>
-          <w:rFonts w:ascii="Consolas" w:eastAsia="Consolas" w:hAnsi="Consolas" w:cs="Consolas"/>
-          <w:sz w:val="19"/>
-          <w:szCs w:val="19"/>
-        </w:rPr>
-        <w:t>Ingles</w:t>
-      </w:r>
-      <w:proofErr w:type="spellEnd"/>
-      <w:r>
-        <w:rPr>
-          <w:rFonts w:ascii="Consolas" w:eastAsia="Consolas" w:hAnsi="Consolas" w:cs="Consolas"/>
-          <w:sz w:val="19"/>
-          <w:szCs w:val="19"/>
-        </w:rPr>
-        <w:t xml:space="preserve">, Geografia, </w:t>
-      </w:r>
-      <w:proofErr w:type="gramStart"/>
-      <w:r>
-        <w:rPr>
-          <w:rFonts w:ascii="Consolas" w:eastAsia="Consolas" w:hAnsi="Consolas" w:cs="Consolas"/>
-          <w:sz w:val="19"/>
-          <w:szCs w:val="19"/>
-        </w:rPr>
-        <w:t>Historia</w:t>
-      </w:r>
-      <w:proofErr w:type="gramEnd"/>
-    </w:p>
-    <w:p>
-      <w:pPr>
-        <w:shd w:val="clear" w:color="auto" w:fill="F2F2F2"/>
-      </w:pPr>
-      <w:proofErr w:type="gramStart"/>
-      <w:r>
-        <w:rPr>
-          <w:rFonts w:ascii="Consolas" w:eastAsia="Consolas" w:hAnsi="Consolas" w:cs="Consolas"/>
-          <w:sz w:val="19"/>
-          <w:szCs w:val="19"/>
-        </w:rPr>
-        <w:t>Media</w:t>
-      </w:r>
-      <w:proofErr w:type="gramEnd"/>
-      <w:r>
-        <w:rPr>
-          <w:rFonts w:ascii="Consolas" w:eastAsia="Consolas" w:hAnsi="Consolas" w:cs="Consolas"/>
-          <w:sz w:val="19"/>
-          <w:szCs w:val="19"/>
-        </w:rPr>
-        <w:t xml:space="preserve"> (coluna calculada automaticamente pelo banco de dados)</w:t>
-      </w:r>
-    </w:p>
-    <w:p>
-      <w:pPr>
-        <w:pStyle w:val="Ttulo1"/>
-        <w:spacing w:before="400" w:after="200"/>
-      </w:pPr>
+        <w:t>1</w:t>
+      </w:r>
       <w:r>
         <w:rPr>
           <w:rFonts w:ascii="Calibri" w:eastAsia="Calibri" w:hAnsi="Calibri" w:cs="Calibri"/>
@@ -3229,7 +3083,18 @@
           <w:sz w:val="26"/>
           <w:szCs w:val="26"/>
         </w:rPr>
-        <w:t>14. Considerações Finais</w:t>
+        <w:t>3</w:t>
+      </w:r>
+      <w:r>
+        <w:rPr>
+          <w:rFonts w:ascii="Calibri" w:eastAsia="Calibri" w:hAnsi="Calibri" w:cs="Calibri"/>
+          <w:b/>
+          <w:bCs/>
+          <w:color w:val="1F4E79"/>
+          <w:sz w:val="26"/>
+          <w:szCs w:val="26"/>
+        </w:rPr>
+        <w:t>. Considerações Finais</w:t>
       </w:r>
     </w:p>
     <w:p>
@@ -3262,32 +3127,6 @@
       <w:pPr>
         <w:spacing w:after="200" w:line="276" w:lineRule="auto"/>
       </w:pPr>
-      <w:r>
-        <w:rPr>
-          <w:rFonts w:ascii="Calibri" w:eastAsia="Calibri" w:hAnsi="Calibri" w:cs="Calibri"/>
-          <w:sz w:val="22"/>
-          <w:szCs w:val="22"/>
-        </w:rPr>
-        <w:t xml:space="preserve">Recomenda-se, como evolução futura, a implementação de criptografia de senhas (atualmente armazenadas em texto simples), a externalização da </w:t>
-      </w:r>
-      <w:proofErr w:type="spellStart"/>
-      <w:r>
-        <w:rPr>
-          <w:rFonts w:ascii="Calibri" w:eastAsia="Calibri" w:hAnsi="Calibri" w:cs="Calibri"/>
-          <w:sz w:val="22"/>
-          <w:szCs w:val="22"/>
-        </w:rPr>
-        <w:t>string</w:t>
-      </w:r>
-      <w:proofErr w:type="spellEnd"/>
-      <w:r>
-        <w:rPr>
-          <w:rFonts w:ascii="Calibri" w:eastAsia="Calibri" w:hAnsi="Calibri" w:cs="Calibri"/>
-          <w:sz w:val="22"/>
-          <w:szCs w:val="22"/>
-        </w:rPr>
-        <w:t xml:space="preserve"> de conexão para um arquivo de configuração e a finalização do módulo Financeiro.</w:t>
-      </w:r>
     </w:p>
     <w:sectPr>
       <w:pgSz w:w="11906" w:h="16838"/>

</xml_diff>